<commit_message>
docs: split CPQ highlights into standalone images
</commit_message>
<xml_diff>
--- a/docs/CPQ系统白皮书/CPQ系统白皮书.docx
+++ b/docs/CPQ系统白皮书/CPQ系统白皮书.docx
@@ -1965,13 +1965,29 @@
     </w:p>
     <w:p>
       <w:pPr>
+        <w:pStyle w:val="Heading2"/>
+        <w:keepNext/>
+        <w:spacing w:before="240" w:after="120"/>
+      </w:pPr>
+      <w:r>
+        <w:rPr>
+          <w:rFonts w:ascii="Microsoft YaHei" w:hAnsi="Microsoft YaHei" w:eastAsia="Microsoft YaHei"/>
+          <w:b/>
+          <w:color w:val="0C6078"/>
+          <w:sz w:val="28"/>
+        </w:rPr>
+        <w:t>4.1 产品配置报价系统</w:t>
+      </w:r>
+    </w:p>
+    <w:p>
+      <w:pPr>
         <w:spacing w:before="120" w:after="160"/>
         <w:jc w:val="center"/>
       </w:pPr>
       <w:r>
         <w:drawing>
           <wp:inline xmlns:a="http://schemas.openxmlformats.org/drawingml/2006/main" xmlns:pic="http://schemas.openxmlformats.org/drawingml/2006/picture">
-            <wp:extent cx="5760720" cy="4032504"/>
+            <wp:extent cx="5760720" cy="3240405"/>
             <wp:docPr id="2" name="Picture 2"/>
             <wp:cNvGraphicFramePr>
               <a:graphicFrameLocks noChangeAspect="1"/>
@@ -1980,7 +1996,7 @@
               <a:graphicData uri="http://schemas.openxmlformats.org/drawingml/2006/picture">
                 <pic:pic>
                   <pic:nvPicPr>
-                    <pic:cNvPr id="0" name="系统亮点.png"/>
+                    <pic:cNvPr id="0" name="01-产品配置报价系统.png"/>
                     <pic:cNvPicPr/>
                   </pic:nvPicPr>
                   <pic:blipFill>
@@ -1992,7 +2008,7 @@
                   <pic:spPr>
                     <a:xfrm>
                       <a:off x="0" y="0"/>
-                      <a:ext cx="5760720" cy="4032504"/>
+                      <a:ext cx="5760720" cy="3240405"/>
                     </a:xfrm>
                     <a:prstGeom prst="rect"/>
                   </pic:spPr>
@@ -2005,22 +2021,6 @@
     </w:p>
     <w:p>
       <w:pPr>
-        <w:pStyle w:val="Heading2"/>
-        <w:keepNext/>
-        <w:spacing w:before="240" w:after="120"/>
-      </w:pPr>
-      <w:r>
-        <w:rPr>
-          <w:rFonts w:ascii="Microsoft YaHei" w:hAnsi="Microsoft YaHei" w:eastAsia="Microsoft YaHei"/>
-          <w:b/>
-          <w:color w:val="0C6078"/>
-          <w:sz w:val="28"/>
-        </w:rPr>
-        <w:t>4.1 配置化报价</w:t>
-      </w:r>
-    </w:p>
-    <w:p>
-      <w:pPr>
         <w:spacing w:before="0" w:after="120" w:line="348" w:lineRule="auto"/>
       </w:pPr>
       <w:r>
@@ -2059,6 +2059,46 @@
     </w:p>
     <w:p>
       <w:pPr>
+        <w:spacing w:before="120" w:after="160"/>
+        <w:jc w:val="center"/>
+      </w:pPr>
+      <w:r>
+        <w:drawing>
+          <wp:inline xmlns:a="http://schemas.openxmlformats.org/drawingml/2006/main" xmlns:pic="http://schemas.openxmlformats.org/drawingml/2006/picture">
+            <wp:extent cx="5760720" cy="3240405"/>
+            <wp:docPr id="3" name="Picture 3"/>
+            <wp:cNvGraphicFramePr>
+              <a:graphicFrameLocks noChangeAspect="1"/>
+            </wp:cNvGraphicFramePr>
+            <a:graphic>
+              <a:graphicData uri="http://schemas.openxmlformats.org/drawingml/2006/picture">
+                <pic:pic>
+                  <pic:nvPicPr>
+                    <pic:cNvPr id="0" name="02-标准化报价模板.png"/>
+                    <pic:cNvPicPr/>
+                  </pic:nvPicPr>
+                  <pic:blipFill>
+                    <a:blip r:embed="rId11"/>
+                    <a:stretch>
+                      <a:fillRect/>
+                    </a:stretch>
+                  </pic:blipFill>
+                  <pic:spPr>
+                    <a:xfrm>
+                      <a:off x="0" y="0"/>
+                      <a:ext cx="5760720" cy="3240405"/>
+                    </a:xfrm>
+                    <a:prstGeom prst="rect"/>
+                  </pic:spPr>
+                </pic:pic>
+              </a:graphicData>
+            </a:graphic>
+          </wp:inline>
+        </w:drawing>
+      </w:r>
+    </w:p>
+    <w:p>
+      <w:pPr>
         <w:spacing w:before="0" w:after="120" w:line="348" w:lineRule="auto"/>
       </w:pPr>
       <w:r>
@@ -2097,6 +2137,46 @@
     </w:p>
     <w:p>
       <w:pPr>
+        <w:spacing w:before="120" w:after="160"/>
+        <w:jc w:val="center"/>
+      </w:pPr>
+      <w:r>
+        <w:drawing>
+          <wp:inline xmlns:a="http://schemas.openxmlformats.org/drawingml/2006/main" xmlns:pic="http://schemas.openxmlformats.org/drawingml/2006/picture">
+            <wp:extent cx="5760720" cy="3240405"/>
+            <wp:docPr id="4" name="Picture 4"/>
+            <wp:cNvGraphicFramePr>
+              <a:graphicFrameLocks noChangeAspect="1"/>
+            </wp:cNvGraphicFramePr>
+            <a:graphic>
+              <a:graphicData uri="http://schemas.openxmlformats.org/drawingml/2006/picture">
+                <pic:pic>
+                  <pic:nvPicPr>
+                    <pic:cNvPr id="0" name="03-BOM与工艺一体化.png"/>
+                    <pic:cNvPicPr/>
+                  </pic:nvPicPr>
+                  <pic:blipFill>
+                    <a:blip r:embed="rId12"/>
+                    <a:stretch>
+                      <a:fillRect/>
+                    </a:stretch>
+                  </pic:blipFill>
+                  <pic:spPr>
+                    <a:xfrm>
+                      <a:off x="0" y="0"/>
+                      <a:ext cx="5760720" cy="3240405"/>
+                    </a:xfrm>
+                    <a:prstGeom prst="rect"/>
+                  </pic:spPr>
+                </pic:pic>
+              </a:graphicData>
+            </a:graphic>
+          </wp:inline>
+        </w:drawing>
+      </w:r>
+    </w:p>
+    <w:p>
+      <w:pPr>
         <w:spacing w:before="0" w:after="120" w:line="348" w:lineRule="auto"/>
       </w:pPr>
       <w:r>
@@ -2135,6 +2215,46 @@
     </w:p>
     <w:p>
       <w:pPr>
+        <w:spacing w:before="120" w:after="160"/>
+        <w:jc w:val="center"/>
+      </w:pPr>
+      <w:r>
+        <w:drawing>
+          <wp:inline xmlns:a="http://schemas.openxmlformats.org/drawingml/2006/main" xmlns:pic="http://schemas.openxmlformats.org/drawingml/2006/picture">
+            <wp:extent cx="5760720" cy="3240405"/>
+            <wp:docPr id="5" name="Picture 5"/>
+            <wp:cNvGraphicFramePr>
+              <a:graphicFrameLocks noChangeAspect="1"/>
+            </wp:cNvGraphicFramePr>
+            <a:graphic>
+              <a:graphicData uri="http://schemas.openxmlformats.org/drawingml/2006/picture">
+                <pic:pic>
+                  <pic:nvPicPr>
+                    <pic:cNvPr id="0" name="04-成交前利润估算.png"/>
+                    <pic:cNvPicPr/>
+                  </pic:nvPicPr>
+                  <pic:blipFill>
+                    <a:blip r:embed="rId13"/>
+                    <a:stretch>
+                      <a:fillRect/>
+                    </a:stretch>
+                  </pic:blipFill>
+                  <pic:spPr>
+                    <a:xfrm>
+                      <a:off x="0" y="0"/>
+                      <a:ext cx="5760720" cy="3240405"/>
+                    </a:xfrm>
+                    <a:prstGeom prst="rect"/>
+                  </pic:spPr>
+                </pic:pic>
+              </a:graphicData>
+            </a:graphic>
+          </wp:inline>
+        </w:drawing>
+      </w:r>
+    </w:p>
+    <w:p>
+      <w:pPr>
         <w:spacing w:before="0" w:after="120" w:line="348" w:lineRule="auto"/>
       </w:pPr>
       <w:r>
@@ -2168,7 +2288,47 @@
           <w:color w:val="0C6078"/>
           <w:sz w:val="28"/>
         </w:rPr>
-        <w:t>4.5 完整数据链与一键回溯</w:t>
+        <w:t>4.5 完整数据链 · 调价不失利</w:t>
+      </w:r>
+    </w:p>
+    <w:p>
+      <w:pPr>
+        <w:spacing w:before="120" w:after="160"/>
+        <w:jc w:val="center"/>
+      </w:pPr>
+      <w:r>
+        <w:drawing>
+          <wp:inline xmlns:a="http://schemas.openxmlformats.org/drawingml/2006/main" xmlns:pic="http://schemas.openxmlformats.org/drawingml/2006/picture">
+            <wp:extent cx="5760720" cy="3240405"/>
+            <wp:docPr id="6" name="Picture 6"/>
+            <wp:cNvGraphicFramePr>
+              <a:graphicFrameLocks noChangeAspect="1"/>
+            </wp:cNvGraphicFramePr>
+            <a:graphic>
+              <a:graphicData uri="http://schemas.openxmlformats.org/drawingml/2006/picture">
+                <pic:pic>
+                  <pic:nvPicPr>
+                    <pic:cNvPr id="0" name="05-完整数据链-调价不失利.png"/>
+                    <pic:cNvPicPr/>
+                  </pic:nvPicPr>
+                  <pic:blipFill>
+                    <a:blip r:embed="rId14"/>
+                    <a:stretch>
+                      <a:fillRect/>
+                    </a:stretch>
+                  </pic:blipFill>
+                  <pic:spPr>
+                    <a:xfrm>
+                      <a:off x="0" y="0"/>
+                      <a:ext cx="5760720" cy="3240405"/>
+                    </a:xfrm>
+                    <a:prstGeom prst="rect"/>
+                  </pic:spPr>
+                </pic:pic>
+              </a:graphicData>
+            </a:graphic>
+          </wp:inline>
+        </w:drawing>
       </w:r>
     </w:p>
     <w:p>
@@ -2206,7 +2366,47 @@
           <w:color w:val="0C6078"/>
           <w:sz w:val="28"/>
         </w:rPr>
-        <w:t>4.6 报价提速与经验沉淀</w:t>
+        <w:t>4.6 报价提速：小时级到分钟级</w:t>
+      </w:r>
+    </w:p>
+    <w:p>
+      <w:pPr>
+        <w:spacing w:before="120" w:after="160"/>
+        <w:jc w:val="center"/>
+      </w:pPr>
+      <w:r>
+        <w:drawing>
+          <wp:inline xmlns:a="http://schemas.openxmlformats.org/drawingml/2006/main" xmlns:pic="http://schemas.openxmlformats.org/drawingml/2006/picture">
+            <wp:extent cx="5760720" cy="3240405"/>
+            <wp:docPr id="7" name="Picture 7"/>
+            <wp:cNvGraphicFramePr>
+              <a:graphicFrameLocks noChangeAspect="1"/>
+            </wp:cNvGraphicFramePr>
+            <a:graphic>
+              <a:graphicData uri="http://schemas.openxmlformats.org/drawingml/2006/picture">
+                <pic:pic>
+                  <pic:nvPicPr>
+                    <pic:cNvPr id="0" name="06-报价提速-小时级到分钟级.png"/>
+                    <pic:cNvPicPr/>
+                  </pic:nvPicPr>
+                  <pic:blipFill>
+                    <a:blip r:embed="rId15"/>
+                    <a:stretch>
+                      <a:fillRect/>
+                    </a:stretch>
+                  </pic:blipFill>
+                  <pic:spPr>
+                    <a:xfrm>
+                      <a:off x="0" y="0"/>
+                      <a:ext cx="5760720" cy="3240405"/>
+                    </a:xfrm>
+                    <a:prstGeom prst="rect"/>
+                  </pic:spPr>
+                </pic:pic>
+              </a:graphicData>
+            </a:graphic>
+          </wp:inline>
+        </w:drawing>
       </w:r>
     </w:p>
     <w:p>
@@ -4975,8 +5175,8 @@
       </w:r>
     </w:p>
     <w:sectPr>
-      <w:headerReference w:type="default" r:id="rId11"/>
-      <w:footerReference w:type="default" r:id="rId12"/>
+      <w:headerReference w:type="default" r:id="rId16"/>
+      <w:footerReference w:type="default" r:id="rId17"/>
       <w:pgSz w:w="11906" w:h="16838"/>
       <w:pgMar w:top="1020" w:right="964" w:bottom="1020" w:left="964" w:header="720" w:footer="720" w:gutter="0"/>
       <w:cols w:space="720"/>

</xml_diff>

<commit_message>
docs: rename CPQ overview graphic
</commit_message>
<xml_diff>
--- a/docs/CPQ系统白皮书/CPQ系统白皮书.docx
+++ b/docs/CPQ系统白皮书/CPQ系统白皮书.docx
@@ -179,7 +179,7 @@
         <w:rPr>
           <w:rFonts w:ascii="Microsoft YaHei" w:hAnsi="Microsoft YaHei" w:eastAsia="Microsoft YaHei"/>
         </w:rPr>
-        <w:t>CPQ 系统一张图</w:t>
+        <w:t>CPQ 业务与能力全景图</w:t>
       </w:r>
     </w:p>
     <w:p>
@@ -468,7 +468,7 @@
           <w:color w:val="092B43"/>
           <w:sz w:val="42"/>
         </w:rPr>
-        <w:t>CPQ 系统一张图</w:t>
+        <w:t>CPQ 业务与能力全景图</w:t>
       </w:r>
     </w:p>
     <w:p>
@@ -488,7 +488,7 @@
               <a:graphicData uri="http://schemas.openxmlformats.org/drawingml/2006/picture">
                 <pic:pic>
                   <pic:nvPicPr>
-                    <pic:cNvPr id="0" name="CPQ系统一张图.png"/>
+                    <pic:cNvPr id="0" name="CPQ业务与能力全景图.png"/>
                     <pic:cNvPicPr/>
                   </pic:nvPicPr>
                   <pic:blipFill>

</xml_diff>